<commit_message>
Guia de cuentas: metodos de acceso verificados (GitHub via Google; Netlify/Supabase via GitHub; Web3Forms con Gmail)
</commit_message>
<xml_diff>
--- a/Guia-Cuentas-LexFive.docx
+++ b/Guia-Cuentas-LexFive.docx
@@ -261,117 +261,130 @@
     </w:p>
     <w:p>
       <w:pPr>
-        <w:spacing w:before="0" w:after="40"/>
-        <w:ind w:left="360"/>
-      </w:pPr>
-      <w:r>
-        <w:rPr>
-          <w:b/>
-          <w:color w:val="A8853C"/>
-          <w:sz w:val="21"/>
-          <w:szCs w:val="21"/>
-        </w:rPr>
-        <w:t xml:space="preserve">•  </w:t>
-      </w:r>
-      <w:r>
-        <w:rPr>
-          <w:color w:val="1A2330"/>
-          <w:sz w:val="21"/>
-          <w:szCs w:val="21"/>
-        </w:rPr>
-        <w:t xml:space="preserve">GitHub — guarda el código del sistema. Entrar en: github.com</w:t>
-      </w:r>
-    </w:p>
-    <w:p>
-      <w:pPr>
-        <w:spacing w:before="0" w:after="40"/>
-        <w:ind w:left="360"/>
-      </w:pPr>
-      <w:r>
-        <w:rPr>
-          <w:b/>
-          <w:color w:val="A8853C"/>
-          <w:sz w:val="21"/>
-          <w:szCs w:val="21"/>
-        </w:rPr>
-        <w:t xml:space="preserve">•  </w:t>
-      </w:r>
-      <w:r>
-        <w:rPr>
-          <w:color w:val="1A2330"/>
-          <w:sz w:val="21"/>
-          <w:szCs w:val="21"/>
-        </w:rPr>
-        <w:t xml:space="preserve">Netlify — publica el sitio en internet. Entrar en: app.netlify.com</w:t>
-      </w:r>
-    </w:p>
-    <w:p>
-      <w:pPr>
-        <w:spacing w:before="0" w:after="40"/>
-        <w:ind w:left="360"/>
-      </w:pPr>
-      <w:r>
-        <w:rPr>
-          <w:b/>
-          <w:color w:val="A8853C"/>
-          <w:sz w:val="21"/>
-          <w:szCs w:val="21"/>
-        </w:rPr>
-        <w:t xml:space="preserve">•  </w:t>
-      </w:r>
-      <w:r>
-        <w:rPr>
-          <w:color w:val="1A2330"/>
-          <w:sz w:val="21"/>
-          <w:szCs w:val="21"/>
-        </w:rPr>
-        <w:t xml:space="preserve">Supabase — base de datos y cuentas de usuario. Entrar en: supabase.com</w:t>
-      </w:r>
-    </w:p>
-    <w:p>
-      <w:pPr>
-        <w:spacing w:before="0" w:after="40"/>
-        <w:ind w:left="360"/>
-      </w:pPr>
-      <w:r>
-        <w:rPr>
-          <w:b/>
-          <w:color w:val="A8853C"/>
-          <w:sz w:val="21"/>
-          <w:szCs w:val="21"/>
-        </w:rPr>
-        <w:t xml:space="preserve">•  </w:t>
-      </w:r>
-      <w:r>
-        <w:rPr>
-          <w:color w:val="1A2330"/>
-          <w:sz w:val="21"/>
-          <w:szCs w:val="21"/>
-        </w:rPr>
-        <w:t xml:space="preserve">Web3Forms — envío por correo de las consultas. Entrar en: web3forms.com</w:t>
-      </w:r>
-    </w:p>
-    <w:p>
-      <w:pPr>
-        <w:spacing w:before="0" w:after="40"/>
-        <w:ind w:left="360"/>
-      </w:pPr>
-      <w:r>
-        <w:rPr>
-          <w:b/>
-          <w:color w:val="A8853C"/>
-          <w:sz w:val="21"/>
-          <w:szCs w:val="21"/>
-        </w:rPr>
-        <w:t xml:space="preserve">•  </w:t>
-      </w:r>
-      <w:r>
-        <w:rPr>
-          <w:color w:val="1A2330"/>
-          <w:sz w:val="21"/>
-          <w:szCs w:val="21"/>
-        </w:rPr>
-        <w:t xml:space="preserve">Correo Gmail del bufete — recibe las consultas y sirve para recuperar contraseñas.</w:t>
+        <w:spacing w:before="0" w:after="80"/>
+      </w:pPr>
+      <w:r>
+        <w:rPr>
+          <w:color w:val="1A2330"/>
+          <w:sz w:val="21"/>
+          <w:szCs w:val="21"/>
+        </w:rPr>
+        <w:t xml:space="preserve">Correo del bufete usado en todas las cuentas: alba23meira@gmail.com</w:t>
+      </w:r>
+    </w:p>
+    <w:p>
+      <w:pPr>
+        <w:spacing w:before="0" w:after="40"/>
+        <w:ind w:left="360"/>
+      </w:pPr>
+      <w:r>
+        <w:rPr>
+          <w:b/>
+          <w:color w:val="A8853C"/>
+          <w:sz w:val="21"/>
+          <w:szCs w:val="21"/>
+        </w:rPr>
+        <w:t xml:space="preserve">•  </w:t>
+      </w:r>
+      <w:r>
+        <w:rPr>
+          <w:color w:val="1A2330"/>
+          <w:sz w:val="21"/>
+          <w:szCs w:val="21"/>
+        </w:rPr>
+        <w:t xml:space="preserve">GitHub — guarda el código. Entrar en github.com con «Continuar con Google».</w:t>
+      </w:r>
+    </w:p>
+    <w:p>
+      <w:pPr>
+        <w:spacing w:before="0" w:after="40"/>
+        <w:ind w:left="360"/>
+      </w:pPr>
+      <w:r>
+        <w:rPr>
+          <w:b/>
+          <w:color w:val="A8853C"/>
+          <w:sz w:val="21"/>
+          <w:szCs w:val="21"/>
+        </w:rPr>
+        <w:t xml:space="preserve">•  </w:t>
+      </w:r>
+      <w:r>
+        <w:rPr>
+          <w:color w:val="1A2330"/>
+          <w:sz w:val="21"/>
+          <w:szCs w:val="21"/>
+        </w:rPr>
+        <w:t xml:space="preserve">Netlify — publica el sitio. Entrar en app.netlify.com con «Continuar con GitHub».</w:t>
+      </w:r>
+    </w:p>
+    <w:p>
+      <w:pPr>
+        <w:spacing w:before="0" w:after="40"/>
+        <w:ind w:left="360"/>
+      </w:pPr>
+      <w:r>
+        <w:rPr>
+          <w:b/>
+          <w:color w:val="A8853C"/>
+          <w:sz w:val="21"/>
+          <w:szCs w:val="21"/>
+        </w:rPr>
+        <w:t xml:space="preserve">•  </w:t>
+      </w:r>
+      <w:r>
+        <w:rPr>
+          <w:color w:val="1A2330"/>
+          <w:sz w:val="21"/>
+          <w:szCs w:val="21"/>
+        </w:rPr>
+        <w:t xml:space="preserve">Supabase — base de datos y usuarios. Entrar en supabase.com con «Continuar con GitHub».</w:t>
+      </w:r>
+    </w:p>
+    <w:p>
+      <w:pPr>
+        <w:spacing w:before="0" w:after="40"/>
+        <w:ind w:left="360"/>
+      </w:pPr>
+      <w:r>
+        <w:rPr>
+          <w:b/>
+          <w:color w:val="A8853C"/>
+          <w:sz w:val="21"/>
+          <w:szCs w:val="21"/>
+        </w:rPr>
+        <w:t xml:space="preserve">•  </w:t>
+      </w:r>
+      <w:r>
+        <w:rPr>
+          <w:color w:val="1A2330"/>
+          <w:sz w:val="21"/>
+          <w:szCs w:val="21"/>
+        </w:rPr>
+        <w:t xml:space="preserve">Web3Forms — envío por correo de las consultas. Funciona con una clave, no con login.</w:t>
+      </w:r>
+    </w:p>
+    <w:p>
+      <w:pPr>
+        <w:spacing w:before="0" w:after="40"/>
+        <w:ind w:left="360"/>
+      </w:pPr>
+      <w:r>
+        <w:rPr>
+          <w:b/>
+          <w:color w:val="A8853C"/>
+          <w:sz w:val="21"/>
+          <w:szCs w:val="21"/>
+        </w:rPr>
+        <w:t xml:space="preserve">•  </w:t>
+      </w:r>
+      <w:r>
+        <w:rPr>
+          <w:color w:val="1A2330"/>
+          <w:sz w:val="21"/>
+          <w:szCs w:val="21"/>
+        </w:rPr>
+        <w:t xml:space="preserve">Correo Gmail del bufete — recibe las consultas y recupera las demás cuentas.</w:t>
       </w:r>
     </w:p>
     <w:p>
@@ -410,7 +423,7 @@
           <w:sz w:val="20"/>
           <w:szCs w:val="20"/>
         </w:rPr>
-        <w:t xml:space="preserve">Cómo se ingresó:  </w:t>
+        <w:t xml:space="preserve">Lo más importante:  </w:t>
       </w:r>
       <w:r>
         <w:rPr>
@@ -418,7 +431,7 @@
           <w:sz w:val="20"/>
           <w:szCs w:val="20"/>
         </w:rPr>
-        <w:t xml:space="preserve">Lo más probable es que haya creado GitHub, Netlify y Supabase con el botón «Continuar con Google», usando el correo del bufete. Si fue así, para entrar a cualquiera de los tres solo debe elegir esa opción de Google; no necesita una contraseña aparte.</w:t>
+        <w:t xml:space="preserve">Cadena de accesos (verificada): Supabase entra con GitHub; Netlify entra con GitHub; y GitHub entra con Google (su Gmail). Por lo tanto, su correo de Google alba23meira@gmail.com es la LLAVE MAESTRA de todo el sistema: cuide muy bien su contraseña y actívele verificación en dos pasos.</w:t>
       </w:r>
     </w:p>
     <w:p>
@@ -482,7 +495,7 @@
           <w:sz w:val="21"/>
           <w:szCs w:val="21"/>
         </w:rPr>
-        <w:t xml:space="preserve">Vaya a github.com e ingrese con la cuenta que usó al crearlo (probablemente «Continuar con Google» usando el correo del bufete).</w:t>
+        <w:t xml:space="preserve">Vaya a github.com y pulse «Sign in».</w:t>
       </w:r>
     </w:p>
     <w:p>
@@ -505,7 +518,7 @@
           <w:sz w:val="21"/>
           <w:szCs w:val="21"/>
         </w:rPr>
-        <w:t xml:space="preserve">Su proyecto (repositorio) se llama «LexFive», dentro de su usuario.</w:t>
+        <w:t xml:space="preserve">Elija «Continuar con Google» con el correo del bufete (alba23meira@gmail.com). Así ingresó su cuenta y es la forma más cómoda.</w:t>
       </w:r>
     </w:p>
     <w:p>
@@ -528,7 +541,7 @@
           <w:sz w:val="21"/>
           <w:szCs w:val="21"/>
         </w:rPr>
-        <w:t xml:space="preserve">Dirección directa del proyecto: github.com/carloscartagena/LexFive</w:t>
+        <w:t xml:space="preserve">Su proyecto (repositorio) se llama «LexFive»: github.com/carloscartagena/LexFive</w:t>
       </w:r>
     </w:p>
     <w:p>
@@ -611,7 +624,7 @@
           <w:sz w:val="21"/>
           <w:szCs w:val="21"/>
         </w:rPr>
-        <w:t xml:space="preserve">No necesita tocar nada del código: de los cambios se encarga el desarrollo.</w:t>
+        <w:t xml:space="preserve">No necesita tocar el código: de los cambios se encarga el desarrollo.</w:t>
       </w:r>
     </w:p>
     <w:p>
@@ -627,7 +640,7 @@
           <w:sz w:val="20"/>
           <w:szCs w:val="20"/>
         </w:rPr>
-        <w:t xml:space="preserve">Acceso con Google:  </w:t>
+        <w:t xml:space="preserve">Su caso:  </w:t>
       </w:r>
       <w:r>
         <w:rPr>
@@ -635,7 +648,7 @@
           <w:sz w:val="20"/>
           <w:szCs w:val="20"/>
         </w:rPr>
-        <w:t xml:space="preserve">Si entró con Google y no recuerda haber puesto contraseña de GitHub, es normal: use siempre «Continuar con Google» con el correo del bufete.</w:t>
+        <w:t xml:space="preserve">Verificado: su GitHub también tiene una contraseña propia configurada. Es decir, puede entrar con «Continuar con Google» o con su correo + contraseña de GitHub. Recomendado: use Google y conserve la contraseña como respaldo.</w:t>
       </w:r>
     </w:p>
     <w:p>
@@ -699,7 +712,7 @@
           <w:sz w:val="21"/>
           <w:szCs w:val="21"/>
         </w:rPr>
-        <w:t xml:space="preserve">Vaya a app.netlify.com e ingrese con la misma cuenta (normalmente «Continuar con GitHub» o «Continuar con Google»).</w:t>
+        <w:t xml:space="preserve">Vaya a app.netlify.com y pulse «Log in».</w:t>
       </w:r>
     </w:p>
     <w:p>
@@ -722,7 +735,7 @@
           <w:sz w:val="21"/>
           <w:szCs w:val="21"/>
         </w:rPr>
-        <w:t xml:space="preserve">En «Sites» verá su sitio «lexfive» (o similar).</w:t>
+        <w:t xml:space="preserve">Elija «Continuar con GitHub» (su cuenta de GitHub está conectada a Netlify).</w:t>
       </w:r>
     </w:p>
     <w:p>
@@ -745,7 +758,7 @@
           <w:sz w:val="21"/>
           <w:szCs w:val="21"/>
         </w:rPr>
-        <w:t xml:space="preserve">Ahí puede ver si la última publicación salió bien, en la sección «Deploys».</w:t>
+        <w:t xml:space="preserve">En «Sites» verá su sitio «lexfive»; en «Deploys» comprueba si la última publicación salió bien.</w:t>
       </w:r>
     </w:p>
     <w:p>
@@ -833,6 +846,30 @@
     </w:p>
     <w:p>
       <w:pPr>
+        <w:spacing w:before="60" w:after="120"/>
+        <w:ind w:left="120"/>
+        <w:shd w:val="clear" w:fill="F6F4ED"/>
+      </w:pPr>
+      <w:r>
+        <w:rPr>
+          <w:b/>
+          <w:color w:val="A8853C"/>
+          <w:sz w:val="20"/>
+          <w:szCs w:val="20"/>
+        </w:rPr>
+        <w:t xml:space="preserve">Su caso:  </w:t>
+      </w:r>
+      <w:r>
+        <w:rPr>
+          <w:color w:val="1A2330"/>
+          <w:sz w:val="20"/>
+          <w:szCs w:val="20"/>
+        </w:rPr>
+        <w:t xml:space="preserve">Verificado: en Netlify, Google NO está conectado, así que NO use «Continuar con Google» aquí. Sí puede entrar con «Continuar con GitHub» o con su correo (alba23meira@gmail.com) + la contraseña propia de Netlify.</w:t>
+      </w:r>
+    </w:p>
+    <w:p>
+      <w:pPr>
         <w:spacing w:before="200" w:after="80"/>
       </w:pPr>
       <w:r>
@@ -892,7 +929,7 @@
           <w:sz w:val="21"/>
           <w:szCs w:val="21"/>
         </w:rPr>
-        <w:t xml:space="preserve">Vaya a supabase.com y pulse «Sign in»; ingrese con la cuenta usada al crearlo (probablemente «Continuar con Google» con el correo del bufete).</w:t>
+        <w:t xml:space="preserve">Vaya a supabase.com y pulse «Sign in».</w:t>
       </w:r>
     </w:p>
     <w:p>
@@ -915,7 +952,7 @@
           <w:sz w:val="21"/>
           <w:szCs w:val="21"/>
         </w:rPr>
-        <w:t xml:space="preserve">Abra su proyecto (el que corresponde a LexFive).</w:t>
+        <w:t xml:space="preserve">Elija «Continuar con GitHub» (su cuenta de Supabase está vinculada a GitHub, con el correo alba23meira@gmail.com).</w:t>
       </w:r>
     </w:p>
     <w:p>
@@ -938,7 +975,7 @@
           <w:sz w:val="21"/>
           <w:szCs w:val="21"/>
         </w:rPr>
-        <w:t xml:space="preserve">Las dos secciones que más usará son: «Authentication → Users» (cuentas de usuario) y «SQL Editor» (para ejecutar los scripts de la carpeta db/).</w:t>
+        <w:t xml:space="preserve">Abra su proyecto (LexFive). Las secciones que más usará: «Authentication → Users» (cuentas) y «SQL Editor» (scripts de la carpeta db/).</w:t>
       </w:r>
     </w:p>
     <w:p>
@@ -1097,7 +1134,7 @@
           <w:sz w:val="20"/>
           <w:szCs w:val="20"/>
         </w:rPr>
-        <w:t xml:space="preserve">Seguridad:  </w:t>
+        <w:t xml:space="preserve">Su caso:  </w:t>
       </w:r>
       <w:r>
         <w:rPr>
@@ -1105,7 +1142,7 @@
           <w:sz w:val="20"/>
           <w:szCs w:val="20"/>
         </w:rPr>
-        <w:t xml:space="preserve">La contraseña de la base de datos y las claves «secretas» de Supabase NO deben compartirse ni pegarse en la web. Las que usa el sistema son las públicas, pensadas para el navegador.</w:t>
+        <w:t xml:space="preserve">Verificado: en «Account identities» figura GitHub (carloscartagena · alba23meira@gmail.com). Su acceso a Supabase pasa por GitHub, así que entre siempre con «Continuar con GitHub». No confunda esto con «Connections → GitHub», que sirve para conectar repositorios y no es su forma de iniciar sesión.</w:t>
       </w:r>
     </w:p>
     <w:p>
@@ -1169,7 +1206,7 @@
           <w:sz w:val="21"/>
           <w:szCs w:val="21"/>
         </w:rPr>
-        <w:t xml:space="preserve">Vaya a web3forms.com.</w:t>
+        <w:t xml:space="preserve">Vaya a web3forms.com e ingrese con su Gmail del bufete (alba23meira@gmail.com), que es con el que se registró.</w:t>
       </w:r>
     </w:p>
     <w:p>
@@ -1192,7 +1229,7 @@
           <w:sz w:val="21"/>
           <w:szCs w:val="21"/>
         </w:rPr>
-        <w:t xml:space="preserve">El servicio funciona con una «Access Key» (clave de acceso) ligada al correo del bufete; no requiere usuario y contraseña tradicionales.</w:t>
+        <w:t xml:space="preserve">El servicio funciona con una «Access Key» (clave de acceso) ligada a ese correo.</w:t>
       </w:r>
     </w:p>
     <w:p>
@@ -1276,6 +1313,30 @@
           <w:szCs w:val="21"/>
         </w:rPr>
         <w:t xml:space="preserve">Si genera una clave nueva, pásesela al desarrollo para reemplazarla en el sistema.</w:t>
+      </w:r>
+    </w:p>
+    <w:p>
+      <w:pPr>
+        <w:spacing w:before="60" w:after="120"/>
+        <w:ind w:left="120"/>
+        <w:shd w:val="clear" w:fill="F6F4ED"/>
+      </w:pPr>
+      <w:r>
+        <w:rPr>
+          <w:b/>
+          <w:color w:val="A8853C"/>
+          <w:sz w:val="20"/>
+          <w:szCs w:val="20"/>
+        </w:rPr>
+        <w:t xml:space="preserve">Su caso:  </w:t>
+      </w:r>
+      <w:r>
+        <w:rPr>
+          <w:color w:val="1A2330"/>
+          <w:sz w:val="20"/>
+          <w:szCs w:val="20"/>
+        </w:rPr>
+        <w:t xml:space="preserve">Verificado: se registró con su Gmail del bufete. Una razón más para cuidar la contraseña de ese correo y activarle verificación en dos pasos.</w:t>
       </w:r>
     </w:p>
     <w:p>

</xml_diff>

<commit_message>
docs(cuentas): agregar Resend a la guia de cuentas y accesos (ingreso con Gmail via Google) + recordatorios
</commit_message>
<xml_diff>
--- a/Guia-Cuentas-LexFive.docx
+++ b/Guia-Cuentas-LexFive.docx
@@ -139,7 +139,7 @@
           <w:sz w:val="21"/>
           <w:szCs w:val="21"/>
         </w:rPr>
-        <w:t xml:space="preserve">•  7. Correo del bufete (Gmail)</w:t>
+        <w:t xml:space="preserve">•  7. Resend — recordatorios de audiencias por correo</w:t>
       </w:r>
     </w:p>
     <w:p>
@@ -153,7 +153,7 @@
           <w:sz w:val="21"/>
           <w:szCs w:val="21"/>
         </w:rPr>
-        <w:t xml:space="preserve">•  8. Panel del sistema LexFive</w:t>
+        <w:t xml:space="preserve">•  8. Correo del bufete (Gmail)</w:t>
       </w:r>
     </w:p>
     <w:p>
@@ -167,7 +167,21 @@
           <w:sz w:val="21"/>
           <w:szCs w:val="21"/>
         </w:rPr>
-        <w:t xml:space="preserve">•  9. Recomendaciones para no perder los accesos</w:t>
+        <w:t xml:space="preserve">•  9. Panel del sistema LexFive</w:t>
+      </w:r>
+    </w:p>
+    <w:p>
+      <w:pPr>
+        <w:spacing w:before="0" w:after="20"/>
+        <w:ind w:left="120"/>
+      </w:pPr>
+      <w:r>
+        <w:rPr>
+          <w:color w:val="1A2330"/>
+          <w:sz w:val="21"/>
+          <w:szCs w:val="21"/>
+        </w:rPr>
+        <w:t xml:space="preserve">•  10. Recomendaciones para no perder los accesos</w:t>
       </w:r>
     </w:p>
     <w:p>
@@ -384,6 +398,29 @@
           <w:sz w:val="21"/>
           <w:szCs w:val="21"/>
         </w:rPr>
+        <w:t xml:space="preserve">Resend — envía los correos de recordatorio de audiencias. Entrar en resend.com con «Continuar con Google» (su Gmail).</w:t>
+      </w:r>
+    </w:p>
+    <w:p>
+      <w:pPr>
+        <w:spacing w:before="0" w:after="40"/>
+        <w:ind w:left="360"/>
+      </w:pPr>
+      <w:r>
+        <w:rPr>
+          <w:b/>
+          <w:color w:val="A8853C"/>
+          <w:sz w:val="21"/>
+          <w:szCs w:val="21"/>
+        </w:rPr>
+        <w:t xml:space="preserve">•  </w:t>
+      </w:r>
+      <w:r>
+        <w:rPr>
+          <w:color w:val="1A2330"/>
+          <w:sz w:val="21"/>
+          <w:szCs w:val="21"/>
+        </w:rPr>
         <w:t xml:space="preserve">Correo Gmail del bufete — recibe las consultas y recupera las demás cuentas.</w:t>
       </w:r>
     </w:p>
@@ -431,7 +468,7 @@
           <w:sz w:val="20"/>
           <w:szCs w:val="20"/>
         </w:rPr>
-        <w:t xml:space="preserve">Cadena de accesos (verificada): Supabase entra con GitHub; Netlify entra con GitHub; y GitHub entra con Google (su Gmail). Por lo tanto, su correo de Google alba23meira@gmail.com es la LLAVE MAESTRA de todo el sistema: cuide muy bien su contraseña y actívele verificación en dos pasos.</w:t>
+        <w:t xml:space="preserve">Cadena de accesos (verificada): Supabase entra con GitHub; Netlify entra con GitHub; GitHub entra con Google (su Gmail); y Resend entra directamente con Google (su Gmail). Por lo tanto, su correo de Google alba23meira@gmail.com es la LLAVE MAESTRA de todo el sistema: cuide muy bien su contraseña y actívele verificación en dos pasos.</w:t>
       </w:r>
     </w:p>
     <w:p>
@@ -1350,7 +1387,7 @@
           <w:sz w:val="30"/>
           <w:szCs w:val="30"/>
         </w:rPr>
-        <w:t xml:space="preserve">7. Correo del bufete (Gmail)</w:t>
+        <w:t xml:space="preserve">7. Resend — recordatorios de audiencias por correo</w:t>
       </w:r>
     </w:p>
     <w:p>
@@ -1363,53 +1400,280 @@
           <w:sz w:val="21"/>
           <w:szCs w:val="21"/>
         </w:rPr>
-        <w:t xml:space="preserve">El correo del bufete es la pieza central de todo: con él se crearon (o se pueden recuperar) las cuentas de GitHub, Netlify y Supabase, y a él llegan las consultas de la web mediante Web3Forms.</w:t>
-      </w:r>
-    </w:p>
-    <w:p>
-      <w:pPr>
-        <w:spacing w:before="0" w:after="40"/>
-        <w:ind w:left="360"/>
-      </w:pPr>
-      <w:r>
-        <w:rPr>
-          <w:b/>
-          <w:color w:val="A8853C"/>
-          <w:sz w:val="21"/>
-          <w:szCs w:val="21"/>
-        </w:rPr>
-        <w:t xml:space="preserve">•  </w:t>
-      </w:r>
-      <w:r>
-        <w:rPr>
-          <w:color w:val="1A2330"/>
-          <w:sz w:val="21"/>
-          <w:szCs w:val="21"/>
-        </w:rPr>
-        <w:t xml:space="preserve">Entrar en: gmail.com (o el proveedor de correo que use el bufete).</w:t>
-      </w:r>
-    </w:p>
-    <w:p>
-      <w:pPr>
-        <w:spacing w:before="0" w:after="40"/>
-        <w:ind w:left="360"/>
-      </w:pPr>
-      <w:r>
-        <w:rPr>
-          <w:b/>
-          <w:color w:val="A8853C"/>
-          <w:sz w:val="21"/>
-          <w:szCs w:val="21"/>
-        </w:rPr>
-        <w:t xml:space="preserve">•  </w:t>
-      </w:r>
-      <w:r>
-        <w:rPr>
-          <w:color w:val="1A2330"/>
-          <w:sz w:val="21"/>
-          <w:szCs w:val="21"/>
-        </w:rPr>
-        <w:t xml:space="preserve">Cuídelo especialmente: quien tenga acceso a este correo podría recuperar las demás cuentas. Use una contraseña fuerte y, de ser posible, verificación en dos pasos.</w:t>
+        <w:t xml:space="preserve">Resend es el servicio que envía, cada mañana y de forma automática, el correo de recordatorio con las audiencias y plazos del día siguiente. Trabaja junto con una función programada dentro de Supabase (no requiere que usted haga nada a diario).</w:t>
+      </w:r>
+    </w:p>
+    <w:p>
+      <w:pPr>
+        <w:spacing w:before="120" w:after="60"/>
+      </w:pPr>
+      <w:r>
+        <w:rPr>
+          <w:b/>
+          <w:color w:val="16273D"/>
+          <w:sz w:val="24"/>
+          <w:szCs w:val="24"/>
+        </w:rPr>
+        <w:t xml:space="preserve">Cómo entrar</w:t>
+      </w:r>
+    </w:p>
+    <w:p>
+      <w:pPr>
+        <w:spacing w:before="0" w:after="40"/>
+        <w:ind w:left="360"/>
+      </w:pPr>
+      <w:r>
+        <w:rPr>
+          <w:b/>
+          <w:color w:val="0E1B2C"/>
+          <w:sz w:val="21"/>
+          <w:szCs w:val="21"/>
+        </w:rPr>
+        <w:t xml:space="preserve">1.  </w:t>
+      </w:r>
+      <w:r>
+        <w:rPr>
+          <w:color w:val="1A2330"/>
+          <w:sz w:val="21"/>
+          <w:szCs w:val="21"/>
+        </w:rPr>
+        <w:t xml:space="preserve">Vaya a resend.com y pulse «Sign in» (Iniciar sesión).</w:t>
+      </w:r>
+    </w:p>
+    <w:p>
+      <w:pPr>
+        <w:spacing w:before="0" w:after="40"/>
+        <w:ind w:left="360"/>
+      </w:pPr>
+      <w:r>
+        <w:rPr>
+          <w:b/>
+          <w:color w:val="0E1B2C"/>
+          <w:sz w:val="21"/>
+          <w:szCs w:val="21"/>
+        </w:rPr>
+        <w:t xml:space="preserve">2.  </w:t>
+      </w:r>
+      <w:r>
+        <w:rPr>
+          <w:color w:val="1A2330"/>
+          <w:sz w:val="21"/>
+          <w:szCs w:val="21"/>
+        </w:rPr>
+        <w:t xml:space="preserve">Elija «Continuar con Google» (Continue with Google) e ingrese con SU GMAIL. En Resend usted inicia sesión directamente con su cuenta de Google, no con usuario y contraseña propios de Resend.</w:t>
+      </w:r>
+    </w:p>
+    <w:p>
+      <w:pPr>
+        <w:spacing w:before="0" w:after="40"/>
+        <w:ind w:left="360"/>
+      </w:pPr>
+      <w:r>
+        <w:rPr>
+          <w:b/>
+          <w:color w:val="0E1B2C"/>
+          <w:sz w:val="21"/>
+          <w:szCs w:val="21"/>
+        </w:rPr>
+        <w:t xml:space="preserve">3.  </w:t>
+      </w:r>
+      <w:r>
+        <w:rPr>
+          <w:color w:val="1A2330"/>
+          <w:sz w:val="21"/>
+          <w:szCs w:val="21"/>
+        </w:rPr>
+        <w:t xml:space="preserve">Si pierde el acceso, recupérelo desde su cuenta de Google (el mismo Gmail).</w:t>
+      </w:r>
+    </w:p>
+    <w:p>
+      <w:pPr>
+        <w:spacing w:before="120" w:after="60"/>
+      </w:pPr>
+      <w:r>
+        <w:rPr>
+          <w:b/>
+          <w:color w:val="16273D"/>
+          <w:sz w:val="24"/>
+          <w:szCs w:val="24"/>
+        </w:rPr>
+        <w:t xml:space="preserve">Para qué lo usará</w:t>
+      </w:r>
+    </w:p>
+    <w:p>
+      <w:pPr>
+        <w:spacing w:before="0" w:after="40"/>
+        <w:ind w:left="360"/>
+      </w:pPr>
+      <w:r>
+        <w:rPr>
+          <w:b/>
+          <w:color w:val="A8853C"/>
+          <w:sz w:val="21"/>
+          <w:szCs w:val="21"/>
+        </w:rPr>
+        <w:t xml:space="preserve">•  </w:t>
+      </w:r>
+      <w:r>
+        <w:rPr>
+          <w:color w:val="1A2330"/>
+          <w:sz w:val="21"/>
+          <w:szCs w:val="21"/>
+        </w:rPr>
+        <w:t xml:space="preserve">Casi nunca en el día a día: los recordatorios se envían solos.</w:t>
+      </w:r>
+    </w:p>
+    <w:p>
+      <w:pPr>
+        <w:spacing w:before="0" w:after="40"/>
+        <w:ind w:left="360"/>
+      </w:pPr>
+      <w:r>
+        <w:rPr>
+          <w:b/>
+          <w:color w:val="A8853C"/>
+          <w:sz w:val="21"/>
+          <w:szCs w:val="21"/>
+        </w:rPr>
+        <w:t xml:space="preserve">•  </w:t>
+      </w:r>
+      <w:r>
+        <w:rPr>
+          <w:color w:val="1A2330"/>
+          <w:sz w:val="21"/>
+          <w:szCs w:val="21"/>
+        </w:rPr>
+        <w:t xml:space="preserve">Para revisar si los correos salieron (sección «Emails» / «Logs» de Resend).</w:t>
+      </w:r>
+    </w:p>
+    <w:p>
+      <w:pPr>
+        <w:spacing w:before="0" w:after="40"/>
+        <w:ind w:left="360"/>
+      </w:pPr>
+      <w:r>
+        <w:rPr>
+          <w:b/>
+          <w:color w:val="A8853C"/>
+          <w:sz w:val="21"/>
+          <w:szCs w:val="21"/>
+        </w:rPr>
+        <w:t xml:space="preserve">•  </w:t>
+      </w:r>
+      <w:r>
+        <w:rPr>
+          <w:color w:val="1A2330"/>
+          <w:sz w:val="21"/>
+          <w:szCs w:val="21"/>
+        </w:rPr>
+        <w:t xml:space="preserve">Más adelante, para verificar un dominio propio (sección «Domains») y así enviar los recordatorios a TODOS los abogados en sus propios correos.</w:t>
+      </w:r>
+    </w:p>
+    <w:p>
+      <w:pPr>
+        <w:spacing w:before="120" w:after="60"/>
+      </w:pPr>
+      <w:r>
+        <w:rPr>
+          <w:b/>
+          <w:color w:val="16273D"/>
+          <w:sz w:val="24"/>
+          <w:szCs w:val="24"/>
+        </w:rPr>
+        <w:t xml:space="preserve">Cómo está configurado hoy</w:t>
+      </w:r>
+    </w:p>
+    <w:p>
+      <w:pPr>
+        <w:spacing w:before="0" w:after="40"/>
+        <w:ind w:left="360"/>
+      </w:pPr>
+      <w:r>
+        <w:rPr>
+          <w:b/>
+          <w:color w:val="A8853C"/>
+          <w:sz w:val="21"/>
+          <w:szCs w:val="21"/>
+        </w:rPr>
+        <w:t xml:space="preserve">•  </w:t>
+      </w:r>
+      <w:r>
+        <w:rPr>
+          <w:color w:val="1A2330"/>
+          <w:sz w:val="21"/>
+          <w:szCs w:val="21"/>
+        </w:rPr>
+        <w:t xml:space="preserve">La clave de Resend (API key) NO se anota aquí: está guardada de forma segura dentro de Supabase, en «Edge Functions → Secrets» (RESEND_API_KEY y MAIL_FROM).</w:t>
+      </w:r>
+    </w:p>
+    <w:p>
+      <w:pPr>
+        <w:spacing w:before="0" w:after="40"/>
+        <w:ind w:left="360"/>
+      </w:pPr>
+      <w:r>
+        <w:rPr>
+          <w:b/>
+          <w:color w:val="A8853C"/>
+          <w:sz w:val="21"/>
+          <w:szCs w:val="21"/>
+        </w:rPr>
+        <w:t xml:space="preserve">•  </w:t>
+      </w:r>
+      <w:r>
+        <w:rPr>
+          <w:color w:val="1A2330"/>
+          <w:sz w:val="21"/>
+          <w:szCs w:val="21"/>
+        </w:rPr>
+        <w:t xml:space="preserve">Por ahora, sin un dominio propio verificado, el recordatorio llega solo al correo del bufete (el dueño de la cuenta), que coordina al equipo.</w:t>
+      </w:r>
+    </w:p>
+    <w:p>
+      <w:pPr>
+        <w:spacing w:before="0" w:after="40"/>
+        <w:ind w:left="360"/>
+      </w:pPr>
+      <w:r>
+        <w:rPr>
+          <w:b/>
+          <w:color w:val="A8853C"/>
+          <w:sz w:val="21"/>
+          <w:szCs w:val="21"/>
+        </w:rPr>
+        <w:t xml:space="preserve">•  </w:t>
+      </w:r>
+      <w:r>
+        <w:rPr>
+          <w:color w:val="1A2330"/>
+          <w:sz w:val="21"/>
+          <w:szCs w:val="21"/>
+        </w:rPr>
+        <w:t xml:space="preserve">El envío diario está programado en Supabase → «Integrations → Cron» (trabajo «LexFive», todos los días a las 07:00 de Bolivia).</w:t>
+      </w:r>
+    </w:p>
+    <w:p>
+      <w:pPr>
+        <w:spacing w:before="60" w:after="120"/>
+        <w:ind w:left="120"/>
+        <w:shd w:val="clear" w:fill="F6F4ED"/>
+      </w:pPr>
+      <w:r>
+        <w:rPr>
+          <w:b/>
+          <w:color w:val="A8853C"/>
+          <w:sz w:val="20"/>
+          <w:szCs w:val="20"/>
+        </w:rPr>
+        <w:t xml:space="preserve">Su caso:  </w:t>
+      </w:r>
+      <w:r>
+        <w:rPr>
+          <w:color w:val="1A2330"/>
+          <w:sz w:val="20"/>
+          <w:szCs w:val="20"/>
+        </w:rPr>
+        <w:t xml:space="preserve">Importante: en Resend usted ingresa con su GMAIL mediante «Continuar con Google». Anote en un lugar privado cuál es ese correo exacto. Como también es su llave para Google, cuide su contraseña y mantenga la verificación en dos pasos activada.</w:t>
       </w:r>
     </w:p>
     <w:p>
@@ -1423,7 +1687,7 @@
           <w:sz w:val="30"/>
           <w:szCs w:val="30"/>
         </w:rPr>
-        <w:t xml:space="preserve">8. Panel del sistema LexFive</w:t>
+        <w:t xml:space="preserve">8. Correo del bufete (Gmail)</w:t>
       </w:r>
     </w:p>
     <w:p>
@@ -1436,76 +1700,53 @@
           <w:sz w:val="21"/>
           <w:szCs w:val="21"/>
         </w:rPr>
-        <w:t xml:space="preserve">No es una cuenta externa, pero es donde trabaja el equipo todos los días. Sus usuarios se administran desde Supabase y desde la propia pestaña «Usuarios» del panel.</w:t>
-      </w:r>
-    </w:p>
-    <w:p>
-      <w:pPr>
-        <w:spacing w:before="0" w:after="40"/>
-        <w:ind w:left="360"/>
-      </w:pPr>
-      <w:r>
-        <w:rPr>
-          <w:b/>
-          <w:color w:val="A8853C"/>
-          <w:sz w:val="21"/>
-          <w:szCs w:val="21"/>
-        </w:rPr>
-        <w:t xml:space="preserve">•  </w:t>
-      </w:r>
-      <w:r>
-        <w:rPr>
-          <w:color w:val="1A2330"/>
-          <w:sz w:val="21"/>
-          <w:szCs w:val="21"/>
-        </w:rPr>
-        <w:t xml:space="preserve">Sitio público: https://lexfive.netlify.app</w:t>
-      </w:r>
-    </w:p>
-    <w:p>
-      <w:pPr>
-        <w:spacing w:before="0" w:after="40"/>
-        <w:ind w:left="360"/>
-      </w:pPr>
-      <w:r>
-        <w:rPr>
-          <w:b/>
-          <w:color w:val="A8853C"/>
-          <w:sz w:val="21"/>
-          <w:szCs w:val="21"/>
-        </w:rPr>
-        <w:t xml:space="preserve">•  </w:t>
-      </w:r>
-      <w:r>
-        <w:rPr>
-          <w:color w:val="1A2330"/>
-          <w:sz w:val="21"/>
-          <w:szCs w:val="21"/>
-        </w:rPr>
-        <w:t xml:space="preserve">Ingreso al panel: https://lexfive.netlify.app/sistema/login.html</w:t>
-      </w:r>
-    </w:p>
-    <w:p>
-      <w:pPr>
-        <w:spacing w:before="0" w:after="40"/>
-        <w:ind w:left="360"/>
-      </w:pPr>
-      <w:r>
-        <w:rPr>
-          <w:b/>
-          <w:color w:val="A8853C"/>
-          <w:sz w:val="21"/>
-          <w:szCs w:val="21"/>
-        </w:rPr>
-        <w:t xml:space="preserve">•  </w:t>
-      </w:r>
-      <w:r>
-        <w:rPr>
-          <w:color w:val="1A2330"/>
-          <w:sz w:val="21"/>
-          <w:szCs w:val="21"/>
-        </w:rPr>
-        <w:t xml:space="preserve">Cada abogado, procurador y cliente entra con su propio correo y contraseña.</w:t>
+        <w:t xml:space="preserve">El correo del bufete es la pieza central de todo: con él se crearon (o se pueden recuperar) las cuentas de GitHub, Netlify y Supabase, y a él llegan las consultas de la web mediante Web3Forms.</w:t>
+      </w:r>
+    </w:p>
+    <w:p>
+      <w:pPr>
+        <w:spacing w:before="0" w:after="40"/>
+        <w:ind w:left="360"/>
+      </w:pPr>
+      <w:r>
+        <w:rPr>
+          <w:b/>
+          <w:color w:val="A8853C"/>
+          <w:sz w:val="21"/>
+          <w:szCs w:val="21"/>
+        </w:rPr>
+        <w:t xml:space="preserve">•  </w:t>
+      </w:r>
+      <w:r>
+        <w:rPr>
+          <w:color w:val="1A2330"/>
+          <w:sz w:val="21"/>
+          <w:szCs w:val="21"/>
+        </w:rPr>
+        <w:t xml:space="preserve">Entrar en: gmail.com (o el proveedor de correo que use el bufete).</w:t>
+      </w:r>
+    </w:p>
+    <w:p>
+      <w:pPr>
+        <w:spacing w:before="0" w:after="40"/>
+        <w:ind w:left="360"/>
+      </w:pPr>
+      <w:r>
+        <w:rPr>
+          <w:b/>
+          <w:color w:val="A8853C"/>
+          <w:sz w:val="21"/>
+          <w:szCs w:val="21"/>
+        </w:rPr>
+        <w:t xml:space="preserve">•  </w:t>
+      </w:r>
+      <w:r>
+        <w:rPr>
+          <w:color w:val="1A2330"/>
+          <w:sz w:val="21"/>
+          <w:szCs w:val="21"/>
+        </w:rPr>
+        <w:t xml:space="preserve">Cuídelo especialmente: quien tenga acceso a este correo podría recuperar las demás cuentas. Use una contraseña fuerte y, de ser posible, verificación en dos pasos.</w:t>
       </w:r>
     </w:p>
     <w:p>
@@ -1519,7 +1760,103 @@
           <w:sz w:val="30"/>
           <w:szCs w:val="30"/>
         </w:rPr>
-        <w:t xml:space="preserve">9. Recomendaciones para no perder los accesos</w:t>
+        <w:t xml:space="preserve">9. Panel del sistema LexFive</w:t>
+      </w:r>
+    </w:p>
+    <w:p>
+      <w:pPr>
+        <w:spacing w:before="0" w:after="80"/>
+      </w:pPr>
+      <w:r>
+        <w:rPr>
+          <w:color w:val="1A2330"/>
+          <w:sz w:val="21"/>
+          <w:szCs w:val="21"/>
+        </w:rPr>
+        <w:t xml:space="preserve">No es una cuenta externa, pero es donde trabaja el equipo todos los días. Sus usuarios se administran desde Supabase y desde la propia pestaña «Usuarios» del panel.</w:t>
+      </w:r>
+    </w:p>
+    <w:p>
+      <w:pPr>
+        <w:spacing w:before="0" w:after="40"/>
+        <w:ind w:left="360"/>
+      </w:pPr>
+      <w:r>
+        <w:rPr>
+          <w:b/>
+          <w:color w:val="A8853C"/>
+          <w:sz w:val="21"/>
+          <w:szCs w:val="21"/>
+        </w:rPr>
+        <w:t xml:space="preserve">•  </w:t>
+      </w:r>
+      <w:r>
+        <w:rPr>
+          <w:color w:val="1A2330"/>
+          <w:sz w:val="21"/>
+          <w:szCs w:val="21"/>
+        </w:rPr>
+        <w:t xml:space="preserve">Sitio público: https://lexfive.netlify.app</w:t>
+      </w:r>
+    </w:p>
+    <w:p>
+      <w:pPr>
+        <w:spacing w:before="0" w:after="40"/>
+        <w:ind w:left="360"/>
+      </w:pPr>
+      <w:r>
+        <w:rPr>
+          <w:b/>
+          <w:color w:val="A8853C"/>
+          <w:sz w:val="21"/>
+          <w:szCs w:val="21"/>
+        </w:rPr>
+        <w:t xml:space="preserve">•  </w:t>
+      </w:r>
+      <w:r>
+        <w:rPr>
+          <w:color w:val="1A2330"/>
+          <w:sz w:val="21"/>
+          <w:szCs w:val="21"/>
+        </w:rPr>
+        <w:t xml:space="preserve">Ingreso al panel: https://lexfive.netlify.app/sistema/login.html</w:t>
+      </w:r>
+    </w:p>
+    <w:p>
+      <w:pPr>
+        <w:spacing w:before="0" w:after="40"/>
+        <w:ind w:left="360"/>
+      </w:pPr>
+      <w:r>
+        <w:rPr>
+          <w:b/>
+          <w:color w:val="A8853C"/>
+          <w:sz w:val="21"/>
+          <w:szCs w:val="21"/>
+        </w:rPr>
+        <w:t xml:space="preserve">•  </w:t>
+      </w:r>
+      <w:r>
+        <w:rPr>
+          <w:color w:val="1A2330"/>
+          <w:sz w:val="21"/>
+          <w:szCs w:val="21"/>
+        </w:rPr>
+        <w:t xml:space="preserve">Cada abogado, procurador y cliente entra con su propio correo y contraseña.</w:t>
+      </w:r>
+    </w:p>
+    <w:p>
+      <w:pPr>
+        <w:spacing w:before="200" w:after="80"/>
+      </w:pPr>
+      <w:r>
+        <w:rPr>
+          <w:b/>
+          <w:color w:val="0E1B2C"/>
+          <w:sz w:val="30"/>
+          <w:szCs w:val="30"/>
+        </w:rPr>
+        <w:t xml:space="preserve">10. Recomendaciones para no perder los accesos</w:t>
       </w:r>
     </w:p>
     <w:p>
@@ -1565,7 +1902,7 @@
           <w:sz w:val="21"/>
           <w:szCs w:val="21"/>
         </w:rPr>
-        <w:t xml:space="preserve">Si entró con «Continuar con Google», entre siempre por esa misma opción.</w:t>
+        <w:t xml:space="preserve">Si entró con «Continuar con Google», entre siempre por esa misma opción (es el caso de GitHub y de Resend).</w:t>
       </w:r>
     </w:p>
     <w:p>
@@ -1611,7 +1948,7 @@
           <w:sz w:val="21"/>
           <w:szCs w:val="21"/>
         </w:rPr>
-        <w:t xml:space="preserve">Active la verificación en dos pasos al menos en el correo y en GitHub.</w:t>
+        <w:t xml:space="preserve">Active la verificación en dos pasos al menos en el correo, en GitHub y en Google.</w:t>
       </w:r>
     </w:p>
     <w:p>

</xml_diff>